<commit_message>
Expand BTS catalog to 79 documented specialties
</commit_message>
<xml_diff>
--- a/downloads/fiches/bts_aeronautique_fiche_evaluation.docx
+++ b/downloads/fiches/bts_aeronautique_fiche_evaluation.docx
@@ -11,8 +11,9 @@
           <w:b/>
           <w:color w:val="1F4E79"/>
           <w:sz w:val="32"/>
+          <w:lang w:val="fr-FR" w:eastAsia="fr-FR" w:bidi="fr-FR"/>
         </w:rPr>
-        <w:t>Fiche d'evaluation reconstituee - BTS Aeronautique</w:t>
+        <w:t>Fiche d'évaluation reconstituée - BTS Aéronautique</w:t>
       </w:r>
     </w:p>
     <w:p>
@@ -23,8 +24,9 @@
         <w:rPr>
           <w:i/>
           <w:sz w:val="21"/>
+          <w:lang w:val="fr-FR" w:eastAsia="fr-FR" w:bidi="fr-FR"/>
         </w:rPr>
-        <w:t>Support evalue : Suivi de productions en milieu professionnel | Modalite : A confirmer</w:t>
+        <w:t>Support évalué : Suivi de productions en milieu professionnel | Modalité : Mixte selon voie</w:t>
       </w:r>
     </w:p>
     <w:p>
@@ -35,8 +37,9 @@
         <w:rPr>
           <w:b/>
           <w:color w:val="C0504D"/>
+          <w:lang w:val="fr-FR" w:eastAsia="fr-FR" w:bidi="fr-FR"/>
         </w:rPr>
-        <w:t>Trame minimale a completer</w:t>
+        <w:t>Trame minimale à compléter</w:t>
       </w:r>
     </w:p>
     <w:p>
@@ -46,8 +49,9 @@
       <w:r>
         <w:rPr>
           <w:i/>
+          <w:lang w:val="fr-FR" w:eastAsia="fr-FR" w:bidi="fr-FR"/>
         </w:rPr>
-        <w:t>Cette fiche est une reconstitution de travail a partir des sources publiques reperees au 28/04/2026. Elle ne remplace pas un formulaire national opposable lorsqu'une grille officielle complete existe par ailleurs. La modalite exacte (CCF ou ponctuelle) reste a confirmer sur la base des textes disponibles.</w:t>
+        <w:t>Cette fiche est une reconstitution de travail à partir des sources publiques repérées au 2026-05-06. Elle ne remplace pas un formulaire national opposable lorsqu'une grille officielle complète existe par ailleurs.</w:t>
       </w:r>
     </w:p>
     <w:tbl>
@@ -74,6 +78,7 @@
             <w:r>
               <w:rPr>
                 <w:b/>
+                <w:lang w:val="fr-FR" w:eastAsia="fr-FR" w:bidi="fr-FR"/>
               </w:rPr>
               <w:t>BTS</w:t>
             </w:r>
@@ -86,7 +91,10 @@
           </w:tcPr>
           <w:p>
             <w:r>
-              <w:t>BTS Aeronautique</w:t>
+              <w:rPr>
+                <w:lang w:val="fr-FR" w:eastAsia="fr-FR" w:bidi="fr-FR"/>
+              </w:rPr>
+              <w:t>BTS Aéronautique</w:t>
             </w:r>
           </w:p>
         </w:tc>
@@ -100,8 +108,9 @@
             <w:r>
               <w:rPr>
                 <w:b/>
+                <w:lang w:val="fr-FR" w:eastAsia="fr-FR" w:bidi="fr-FR"/>
               </w:rPr>
-              <w:t>Modalite</w:t>
+              <w:t>Modalité</w:t>
             </w:r>
           </w:p>
         </w:tc>
@@ -112,7 +121,10 @@
           </w:tcPr>
           <w:p>
             <w:r>
-              <w:t>A confirmer</w:t>
+              <w:rPr>
+                <w:lang w:val="fr-FR" w:eastAsia="fr-FR" w:bidi="fr-FR"/>
+              </w:rPr>
+              <w:t>Mixte selon voie</w:t>
             </w:r>
           </w:p>
         </w:tc>
@@ -128,6 +140,7 @@
             <w:r>
               <w:rPr>
                 <w:b/>
+                <w:lang w:val="fr-FR" w:eastAsia="fr-FR" w:bidi="fr-FR"/>
               </w:rPr>
               <w:t>Option</w:t>
             </w:r>
@@ -140,7 +153,10 @@
           </w:tcPr>
           <w:p>
             <w:r>
-              <w:t>Sans option specifiee</w:t>
+              <w:rPr>
+                <w:lang w:val="fr-FR" w:eastAsia="fr-FR" w:bidi="fr-FR"/>
+              </w:rPr>
+              <w:t>Sans option spécifiée</w:t>
             </w:r>
           </w:p>
         </w:tc>
@@ -154,6 +170,7 @@
             <w:r>
               <w:rPr>
                 <w:b/>
+                <w:lang w:val="fr-FR" w:eastAsia="fr-FR" w:bidi="fr-FR"/>
               </w:rPr>
               <w:t>Statut documentaire</w:t>
             </w:r>
@@ -166,7 +183,10 @@
           </w:tcPr>
           <w:p>
             <w:r>
-              <w:t>Repere officiel dans l'annexe 2020 - modalite CCF a verifier</w:t>
+              <w:rPr>
+                <w:lang w:val="fr-FR" w:eastAsia="fr-FR" w:bidi="fr-FR"/>
+              </w:rPr>
+              <w:t>CCF ou ponctuelle selon voie ; dossier support confirme</w:t>
             </w:r>
           </w:p>
         </w:tc>
@@ -182,6 +202,7 @@
             <w:r>
               <w:rPr>
                 <w:b/>
+                <w:lang w:val="fr-FR" w:eastAsia="fr-FR" w:bidi="fr-FR"/>
               </w:rPr>
               <w:t>Support</w:t>
             </w:r>
@@ -194,6 +215,9 @@
           </w:tcPr>
           <w:p>
             <w:r>
+              <w:rPr>
+                <w:lang w:val="fr-FR" w:eastAsia="fr-FR" w:bidi="fr-FR"/>
+              </w:rPr>
               <w:t>Suivi de productions en milieu professionnel</w:t>
             </w:r>
           </w:p>
@@ -208,8 +232,9 @@
             <w:r>
               <w:rPr>
                 <w:b/>
+                <w:lang w:val="fr-FR" w:eastAsia="fr-FR" w:bidi="fr-FR"/>
               </w:rPr>
-              <w:t>Epreuve</w:t>
+              <w:t>Épreuve</w:t>
             </w:r>
           </w:p>
         </w:tc>
@@ -220,6 +245,9 @@
           </w:tcPr>
           <w:p>
             <w:r>
+              <w:rPr>
+                <w:lang w:val="fr-FR" w:eastAsia="fr-FR" w:bidi="fr-FR"/>
+              </w:rPr>
               <w:t>E61 Suivi de productions en milieu professionnel</w:t>
             </w:r>
           </w:p>
@@ -236,8 +264,9 @@
             <w:r>
               <w:rPr>
                 <w:b/>
+                <w:lang w:val="fr-FR" w:eastAsia="fr-FR" w:bidi="fr-FR"/>
               </w:rPr>
-              <w:t>Voies / modalites</w:t>
+              <w:t>Voies / modalités</w:t>
             </w:r>
           </w:p>
         </w:tc>
@@ -248,7 +277,10 @@
           </w:tcPr>
           <w:p>
             <w:r>
-              <w:t>Epreuve adossee au milieu professionnel ; verification fine du support et du CCF a poursuivre.</w:t>
+              <w:rPr>
+                <w:lang w:val="fr-FR" w:eastAsia="fr-FR" w:bidi="fr-FR"/>
+              </w:rPr>
+              <w:t>CCF ou ponctuelle selon voie</w:t>
             </w:r>
           </w:p>
         </w:tc>
@@ -262,6 +294,7 @@
             <w:r>
               <w:rPr>
                 <w:b/>
+                <w:lang w:val="fr-FR" w:eastAsia="fr-FR" w:bidi="fr-FR"/>
               </w:rPr>
               <w:t>Niveau de reconstitution</w:t>
             </w:r>
@@ -274,7 +307,10 @@
           </w:tcPr>
           <w:p>
             <w:r>
-              <w:t>Trame minimale a completer</w:t>
+              <w:rPr>
+                <w:lang w:val="fr-FR" w:eastAsia="fr-FR" w:bidi="fr-FR"/>
+              </w:rPr>
+              <w:t>Trame minimale à compléter</w:t>
             </w:r>
           </w:p>
         </w:tc>
@@ -290,8 +326,9 @@
             <w:r>
               <w:rPr>
                 <w:b/>
+                <w:lang w:val="fr-FR" w:eastAsia="fr-FR" w:bidi="fr-FR"/>
               </w:rPr>
-              <w:t>Sources modele</w:t>
+              <w:t>Sources modèle</w:t>
             </w:r>
           </w:p>
         </w:tc>
@@ -302,6 +339,9 @@
           </w:tcPr>
           <w:p>
             <w:r>
+              <w:rPr>
+                <w:lang w:val="fr-FR" w:eastAsia="fr-FR" w:bidi="fr-FR"/>
+              </w:rPr>
               <w:t>Le référentiel du BTS Aéronautique mentionne l'utilisation d'une grille d'évaluation pour le contrôle en cours de formation (CCF) de certaines épreuves, notamment la physique-chimie, mais la grille spécifique pour l'épreuve E61 n'est pas directement accessible. Un rapport de stage est requis pour l'épreuve E61.</w:t>
             </w:r>
           </w:p>
@@ -316,6 +356,7 @@
             <w:r>
               <w:rPr>
                 <w:b/>
+                <w:lang w:val="fr-FR" w:eastAsia="fr-FR" w:bidi="fr-FR"/>
               </w:rPr>
               <w:t>Document jury</w:t>
             </w:r>
@@ -328,7 +369,10 @@
           </w:tcPr>
           <w:p>
             <w:r>
-              <w:t>Non retrouve</w:t>
+              <w:rPr>
+                <w:lang w:val="fr-FR" w:eastAsia="fr-FR" w:bidi="fr-FR"/>
+              </w:rPr>
+              <w:t>Non retrouvé</w:t>
             </w:r>
           </w:p>
         </w:tc>
@@ -339,8 +383,9 @@
       <w:r>
         <w:rPr>
           <w:b/>
+          <w:lang w:val="fr-FR" w:eastAsia="fr-FR" w:bidi="fr-FR"/>
         </w:rPr>
-        <w:t>Echelle de positionnement conseillee</w:t>
+        <w:t>Échelle de positionnement conseillée</w:t>
       </w:r>
     </w:p>
     <w:tbl>
@@ -366,6 +411,7 @@
             <w:r>
               <w:rPr>
                 <w:b/>
+                <w:lang w:val="fr-FR" w:eastAsia="fr-FR" w:bidi="fr-FR"/>
               </w:rPr>
               <w:t>NA</w:t>
             </w:r>
@@ -380,6 +426,7 @@
             <w:r>
               <w:rPr>
                 <w:b/>
+                <w:lang w:val="fr-FR" w:eastAsia="fr-FR" w:bidi="fr-FR"/>
               </w:rPr>
               <w:t>PA</w:t>
             </w:r>
@@ -394,6 +441,7 @@
             <w:r>
               <w:rPr>
                 <w:b/>
+                <w:lang w:val="fr-FR" w:eastAsia="fr-FR" w:bidi="fr-FR"/>
               </w:rPr>
               <w:t>A</w:t>
             </w:r>
@@ -408,6 +456,7 @@
             <w:r>
               <w:rPr>
                 <w:b/>
+                <w:lang w:val="fr-FR" w:eastAsia="fr-FR" w:bidi="fr-FR"/>
               </w:rPr>
               <w:t>TB</w:t>
             </w:r>
@@ -421,6 +470,9 @@
           </w:tcPr>
           <w:p>
             <w:r>
+              <w:rPr>
+                <w:lang w:val="fr-FR" w:eastAsia="fr-FR" w:bidi="fr-FR"/>
+              </w:rPr>
               <w:t>Non observable / non acquis</w:t>
             </w:r>
           </w:p>
@@ -431,6 +483,9 @@
           </w:tcPr>
           <w:p>
             <w:r>
+              <w:rPr>
+                <w:lang w:val="fr-FR" w:eastAsia="fr-FR" w:bidi="fr-FR"/>
+              </w:rPr>
               <w:t>Partiellement acquis</w:t>
             </w:r>
           </w:p>
@@ -441,6 +496,9 @@
           </w:tcPr>
           <w:p>
             <w:r>
+              <w:rPr>
+                <w:lang w:val="fr-FR" w:eastAsia="fr-FR" w:bidi="fr-FR"/>
+              </w:rPr>
               <w:t>Acquis</w:t>
             </w:r>
           </w:p>
@@ -451,7 +509,10 @@
           </w:tcPr>
           <w:p>
             <w:r>
-              <w:t>Tres bien acquis</w:t>
+              <w:rPr>
+                <w:lang w:val="fr-FR" w:eastAsia="fr-FR" w:bidi="fr-FR"/>
+              </w:rPr>
+              <w:t>Très bien acquis</w:t>
             </w:r>
           </w:p>
         </w:tc>
@@ -462,8 +523,9 @@
       <w:r>
         <w:rPr>
           <w:b/>
+          <w:lang w:val="fr-FR" w:eastAsia="fr-FR" w:bidi="fr-FR"/>
         </w:rPr>
-        <w:t>Grille d'evaluation</w:t>
+        <w:t>Grille d'évaluation</w:t>
       </w:r>
     </w:p>
     <w:tbl>
@@ -500,8 +562,9 @@
               <w:rPr>
                 <w:b/>
                 <w:sz w:val="19"/>
+                <w:lang w:val="fr-FR" w:eastAsia="fr-FR" w:bidi="fr-FR"/>
               </w:rPr>
-              <w:t>Critere evalue</w:t>
+              <w:t>Critère évalué</w:t>
             </w:r>
           </w:p>
         </w:tc>
@@ -519,6 +582,7 @@
               <w:rPr>
                 <w:b/>
                 <w:sz w:val="19"/>
+                <w:lang w:val="fr-FR" w:eastAsia="fr-FR" w:bidi="fr-FR"/>
               </w:rPr>
               <w:t>Indicateurs observables / questions d'appui</w:t>
             </w:r>
@@ -538,6 +602,7 @@
               <w:rPr>
                 <w:b/>
                 <w:sz w:val="19"/>
+                <w:lang w:val="fr-FR" w:eastAsia="fr-FR" w:bidi="fr-FR"/>
               </w:rPr>
               <w:t>NA</w:t>
             </w:r>
@@ -557,6 +622,7 @@
               <w:rPr>
                 <w:b/>
                 <w:sz w:val="19"/>
+                <w:lang w:val="fr-FR" w:eastAsia="fr-FR" w:bidi="fr-FR"/>
               </w:rPr>
               <w:t>PA</w:t>
             </w:r>
@@ -576,6 +642,7 @@
               <w:rPr>
                 <w:b/>
                 <w:sz w:val="19"/>
+                <w:lang w:val="fr-FR" w:eastAsia="fr-FR" w:bidi="fr-FR"/>
               </w:rPr>
               <w:t>A</w:t>
             </w:r>
@@ -595,6 +662,7 @@
               <w:rPr>
                 <w:b/>
                 <w:sz w:val="19"/>
+                <w:lang w:val="fr-FR" w:eastAsia="fr-FR" w:bidi="fr-FR"/>
               </w:rPr>
               <w:t>TB</w:t>
             </w:r>
@@ -614,6 +682,7 @@
               <w:rPr>
                 <w:b/>
                 <w:sz w:val="19"/>
+                <w:lang w:val="fr-FR" w:eastAsia="fr-FR" w:bidi="fr-FR"/>
               </w:rPr>
               <w:t>Observations</w:t>
             </w:r>
@@ -631,6 +700,9 @@
               <w:spacing w:after="0"/>
             </w:pPr>
             <w:r>
+              <w:rPr>
+                <w:lang w:val="fr-FR" w:eastAsia="fr-FR" w:bidi="fr-FR"/>
+              </w:rPr>
               <w:t>Contextualisation de l'entreprise, du service, du chantier ou de l'environnement professionnel</w:t>
             </w:r>
           </w:p>
@@ -645,7 +717,10 @@
               <w:spacing w:after="0"/>
             </w:pPr>
             <w:r>
-              <w:t>Le candidat situe precisement l'organisation, ses missions et le perimetre de son intervention.</w:t>
+              <w:rPr>
+                <w:lang w:val="fr-FR" w:eastAsia="fr-FR" w:bidi="fr-FR"/>
+              </w:rPr>
+              <w:t>Le candidat situe précisément l'organisation, ses missions et le périmètre de son intervention.</w:t>
             </w:r>
           </w:p>
         </w:tc>
@@ -659,7 +734,11 @@
               <w:spacing w:after="0"/>
               <w:jc w:val="center"/>
             </w:pPr>
-            <w:r/>
+            <w:r>
+              <w:rPr>
+                <w:lang w:val="fr-FR" w:eastAsia="fr-FR" w:bidi="fr-FR"/>
+              </w:rPr>
+            </w:r>
           </w:p>
         </w:tc>
         <w:tc>
@@ -672,7 +751,11 @@
               <w:spacing w:after="0"/>
               <w:jc w:val="center"/>
             </w:pPr>
-            <w:r/>
+            <w:r>
+              <w:rPr>
+                <w:lang w:val="fr-FR" w:eastAsia="fr-FR" w:bidi="fr-FR"/>
+              </w:rPr>
+            </w:r>
           </w:p>
         </w:tc>
         <w:tc>
@@ -685,7 +768,11 @@
               <w:spacing w:after="0"/>
               <w:jc w:val="center"/>
             </w:pPr>
-            <w:r/>
+            <w:r>
+              <w:rPr>
+                <w:lang w:val="fr-FR" w:eastAsia="fr-FR" w:bidi="fr-FR"/>
+              </w:rPr>
+            </w:r>
           </w:p>
         </w:tc>
         <w:tc>
@@ -698,7 +785,11 @@
               <w:spacing w:after="0"/>
               <w:jc w:val="center"/>
             </w:pPr>
-            <w:r/>
+            <w:r>
+              <w:rPr>
+                <w:lang w:val="fr-FR" w:eastAsia="fr-FR" w:bidi="fr-FR"/>
+              </w:rPr>
+            </w:r>
           </w:p>
         </w:tc>
         <w:tc>
@@ -710,7 +801,11 @@
             <w:pPr>
               <w:spacing w:after="0"/>
             </w:pPr>
-            <w:r/>
+            <w:r>
+              <w:rPr>
+                <w:lang w:val="fr-FR" w:eastAsia="fr-FR" w:bidi="fr-FR"/>
+              </w:rPr>
+            </w:r>
           </w:p>
         </w:tc>
       </w:tr>
@@ -725,7 +820,10 @@
               <w:spacing w:after="0"/>
             </w:pPr>
             <w:r>
-              <w:t>Description claire des activites, missions ou productions realisees</w:t>
+              <w:rPr>
+                <w:lang w:val="fr-FR" w:eastAsia="fr-FR" w:bidi="fr-FR"/>
+              </w:rPr>
+              <w:t>Description claire des activités, missions ou productions réalisées</w:t>
             </w:r>
           </w:p>
         </w:tc>
@@ -739,7 +837,10 @@
               <w:spacing w:after="0"/>
             </w:pPr>
             <w:r>
-              <w:t>Les techniques, outils et methodes mobilises sont expliques et justifies avec exactitude.</w:t>
+              <w:rPr>
+                <w:lang w:val="fr-FR" w:eastAsia="fr-FR" w:bidi="fr-FR"/>
+              </w:rPr>
+              <w:t>Les techniques, outils et méthodes mobilisés sont expliqués et justifiés avec exactitude.</w:t>
             </w:r>
           </w:p>
         </w:tc>
@@ -753,7 +854,11 @@
               <w:spacing w:after="0"/>
               <w:jc w:val="center"/>
             </w:pPr>
-            <w:r/>
+            <w:r>
+              <w:rPr>
+                <w:lang w:val="fr-FR" w:eastAsia="fr-FR" w:bidi="fr-FR"/>
+              </w:rPr>
+            </w:r>
           </w:p>
         </w:tc>
         <w:tc>
@@ -766,7 +871,11 @@
               <w:spacing w:after="0"/>
               <w:jc w:val="center"/>
             </w:pPr>
-            <w:r/>
+            <w:r>
+              <w:rPr>
+                <w:lang w:val="fr-FR" w:eastAsia="fr-FR" w:bidi="fr-FR"/>
+              </w:rPr>
+            </w:r>
           </w:p>
         </w:tc>
         <w:tc>
@@ -779,7 +888,11 @@
               <w:spacing w:after="0"/>
               <w:jc w:val="center"/>
             </w:pPr>
-            <w:r/>
+            <w:r>
+              <w:rPr>
+                <w:lang w:val="fr-FR" w:eastAsia="fr-FR" w:bidi="fr-FR"/>
+              </w:rPr>
+            </w:r>
           </w:p>
         </w:tc>
         <w:tc>
@@ -792,7 +905,11 @@
               <w:spacing w:after="0"/>
               <w:jc w:val="center"/>
             </w:pPr>
-            <w:r/>
+            <w:r>
+              <w:rPr>
+                <w:lang w:val="fr-FR" w:eastAsia="fr-FR" w:bidi="fr-FR"/>
+              </w:rPr>
+            </w:r>
           </w:p>
         </w:tc>
         <w:tc>
@@ -804,7 +921,11 @@
             <w:pPr>
               <w:spacing w:after="0"/>
             </w:pPr>
-            <w:r/>
+            <w:r>
+              <w:rPr>
+                <w:lang w:val="fr-FR" w:eastAsia="fr-FR" w:bidi="fr-FR"/>
+              </w:rPr>
+            </w:r>
           </w:p>
         </w:tc>
       </w:tr>
@@ -819,7 +940,10 @@
               <w:spacing w:after="0"/>
             </w:pPr>
             <w:r>
-              <w:t>Maitrise technique et professionnelle des activites presentees</w:t>
+              <w:rPr>
+                <w:lang w:val="fr-FR" w:eastAsia="fr-FR" w:bidi="fr-FR"/>
+              </w:rPr>
+              <w:t>Maîtrise technique et professionnelle des activités présentées</w:t>
             </w:r>
           </w:p>
         </w:tc>
@@ -833,7 +957,10 @@
               <w:spacing w:after="0"/>
             </w:pPr>
             <w:r>
-              <w:t>Les techniques, outils et methodes mobilises sont expliques et justifies avec exactitude.</w:t>
+              <w:rPr>
+                <w:lang w:val="fr-FR" w:eastAsia="fr-FR" w:bidi="fr-FR"/>
+              </w:rPr>
+              <w:t>Les techniques, outils et méthodes mobilisés sont expliqués et justifiés avec exactitude.</w:t>
             </w:r>
           </w:p>
         </w:tc>
@@ -847,7 +974,11 @@
               <w:spacing w:after="0"/>
               <w:jc w:val="center"/>
             </w:pPr>
-            <w:r/>
+            <w:r>
+              <w:rPr>
+                <w:lang w:val="fr-FR" w:eastAsia="fr-FR" w:bidi="fr-FR"/>
+              </w:rPr>
+            </w:r>
           </w:p>
         </w:tc>
         <w:tc>
@@ -860,7 +991,11 @@
               <w:spacing w:after="0"/>
               <w:jc w:val="center"/>
             </w:pPr>
-            <w:r/>
+            <w:r>
+              <w:rPr>
+                <w:lang w:val="fr-FR" w:eastAsia="fr-FR" w:bidi="fr-FR"/>
+              </w:rPr>
+            </w:r>
           </w:p>
         </w:tc>
         <w:tc>
@@ -873,7 +1008,11 @@
               <w:spacing w:after="0"/>
               <w:jc w:val="center"/>
             </w:pPr>
-            <w:r/>
+            <w:r>
+              <w:rPr>
+                <w:lang w:val="fr-FR" w:eastAsia="fr-FR" w:bidi="fr-FR"/>
+              </w:rPr>
+            </w:r>
           </w:p>
         </w:tc>
         <w:tc>
@@ -886,7 +1025,11 @@
               <w:spacing w:after="0"/>
               <w:jc w:val="center"/>
             </w:pPr>
-            <w:r/>
+            <w:r>
+              <w:rPr>
+                <w:lang w:val="fr-FR" w:eastAsia="fr-FR" w:bidi="fr-FR"/>
+              </w:rPr>
+            </w:r>
           </w:p>
         </w:tc>
         <w:tc>
@@ -898,7 +1041,11 @@
             <w:pPr>
               <w:spacing w:after="0"/>
             </w:pPr>
-            <w:r/>
+            <w:r>
+              <w:rPr>
+                <w:lang w:val="fr-FR" w:eastAsia="fr-FR" w:bidi="fr-FR"/>
+              </w:rPr>
+            </w:r>
           </w:p>
         </w:tc>
       </w:tr>
@@ -913,7 +1060,10 @@
               <w:spacing w:after="0"/>
             </w:pPr>
             <w:r>
-              <w:t>Organisation, suivi et pilotage de l'activite ou du projet en entreprise</w:t>
+              <w:rPr>
+                <w:lang w:val="fr-FR" w:eastAsia="fr-FR" w:bidi="fr-FR"/>
+              </w:rPr>
+              <w:t>Organisation, suivi et pilotage de l'activité ou du projet en entreprise</w:t>
             </w:r>
           </w:p>
         </w:tc>
@@ -927,7 +1077,10 @@
               <w:spacing w:after="0"/>
             </w:pPr>
             <w:r>
-              <w:t>Le candidat situe precisement l'organisation, ses missions et le perimetre de son intervention.</w:t>
+              <w:rPr>
+                <w:lang w:val="fr-FR" w:eastAsia="fr-FR" w:bidi="fr-FR"/>
+              </w:rPr>
+              <w:t>Le candidat situe précisément l'organisation, ses missions et le périmètre de son intervention.</w:t>
             </w:r>
           </w:p>
         </w:tc>
@@ -941,7 +1094,11 @@
               <w:spacing w:after="0"/>
               <w:jc w:val="center"/>
             </w:pPr>
-            <w:r/>
+            <w:r>
+              <w:rPr>
+                <w:lang w:val="fr-FR" w:eastAsia="fr-FR" w:bidi="fr-FR"/>
+              </w:rPr>
+            </w:r>
           </w:p>
         </w:tc>
         <w:tc>
@@ -954,7 +1111,11 @@
               <w:spacing w:after="0"/>
               <w:jc w:val="center"/>
             </w:pPr>
-            <w:r/>
+            <w:r>
+              <w:rPr>
+                <w:lang w:val="fr-FR" w:eastAsia="fr-FR" w:bidi="fr-FR"/>
+              </w:rPr>
+            </w:r>
           </w:p>
         </w:tc>
         <w:tc>
@@ -967,7 +1128,11 @@
               <w:spacing w:after="0"/>
               <w:jc w:val="center"/>
             </w:pPr>
-            <w:r/>
+            <w:r>
+              <w:rPr>
+                <w:lang w:val="fr-FR" w:eastAsia="fr-FR" w:bidi="fr-FR"/>
+              </w:rPr>
+            </w:r>
           </w:p>
         </w:tc>
         <w:tc>
@@ -980,7 +1145,11 @@
               <w:spacing w:after="0"/>
               <w:jc w:val="center"/>
             </w:pPr>
-            <w:r/>
+            <w:r>
+              <w:rPr>
+                <w:lang w:val="fr-FR" w:eastAsia="fr-FR" w:bidi="fr-FR"/>
+              </w:rPr>
+            </w:r>
           </w:p>
         </w:tc>
         <w:tc>
@@ -992,7 +1161,11 @@
             <w:pPr>
               <w:spacing w:after="0"/>
             </w:pPr>
-            <w:r/>
+            <w:r>
+              <w:rPr>
+                <w:lang w:val="fr-FR" w:eastAsia="fr-FR" w:bidi="fr-FR"/>
+              </w:rPr>
+            </w:r>
           </w:p>
         </w:tc>
       </w:tr>
@@ -1007,7 +1180,10 @@
               <w:spacing w:after="0"/>
             </w:pPr>
             <w:r>
-              <w:t>Analyse des choix, contraintes, resultats et ecarts</w:t>
+              <w:rPr>
+                <w:lang w:val="fr-FR" w:eastAsia="fr-FR" w:bidi="fr-FR"/>
+              </w:rPr>
+              <w:t>Analyse des choix, contraintes, résultats et écarts</w:t>
             </w:r>
           </w:p>
         </w:tc>
@@ -1021,7 +1197,10 @@
               <w:spacing w:after="0"/>
             </w:pPr>
             <w:r>
-              <w:t>Les choix, contraintes, resultats et eventuels ecarts sont analyses avec recul professionnel.</w:t>
+              <w:rPr>
+                <w:lang w:val="fr-FR" w:eastAsia="fr-FR" w:bidi="fr-FR"/>
+              </w:rPr>
+              <w:t>Les choix, contraintes, résultats et éventuels écarts sont analysés avec recul professionnel.</w:t>
             </w:r>
           </w:p>
         </w:tc>
@@ -1035,7 +1214,11 @@
               <w:spacing w:after="0"/>
               <w:jc w:val="center"/>
             </w:pPr>
-            <w:r/>
+            <w:r>
+              <w:rPr>
+                <w:lang w:val="fr-FR" w:eastAsia="fr-FR" w:bidi="fr-FR"/>
+              </w:rPr>
+            </w:r>
           </w:p>
         </w:tc>
         <w:tc>
@@ -1048,7 +1231,11 @@
               <w:spacing w:after="0"/>
               <w:jc w:val="center"/>
             </w:pPr>
-            <w:r/>
+            <w:r>
+              <w:rPr>
+                <w:lang w:val="fr-FR" w:eastAsia="fr-FR" w:bidi="fr-FR"/>
+              </w:rPr>
+            </w:r>
           </w:p>
         </w:tc>
         <w:tc>
@@ -1061,7 +1248,11 @@
               <w:spacing w:after="0"/>
               <w:jc w:val="center"/>
             </w:pPr>
-            <w:r/>
+            <w:r>
+              <w:rPr>
+                <w:lang w:val="fr-FR" w:eastAsia="fr-FR" w:bidi="fr-FR"/>
+              </w:rPr>
+            </w:r>
           </w:p>
         </w:tc>
         <w:tc>
@@ -1074,7 +1265,11 @@
               <w:spacing w:after="0"/>
               <w:jc w:val="center"/>
             </w:pPr>
-            <w:r/>
+            <w:r>
+              <w:rPr>
+                <w:lang w:val="fr-FR" w:eastAsia="fr-FR" w:bidi="fr-FR"/>
+              </w:rPr>
+            </w:r>
           </w:p>
         </w:tc>
         <w:tc>
@@ -1086,7 +1281,11 @@
             <w:pPr>
               <w:spacing w:after="0"/>
             </w:pPr>
-            <w:r/>
+            <w:r>
+              <w:rPr>
+                <w:lang w:val="fr-FR" w:eastAsia="fr-FR" w:bidi="fr-FR"/>
+              </w:rPr>
+            </w:r>
           </w:p>
         </w:tc>
       </w:tr>
@@ -1101,7 +1300,10 @@
               <w:spacing w:after="0"/>
             </w:pPr>
             <w:r>
-              <w:t>Respect des regles de qualite, de securite, de methode et de tracabilite</w:t>
+              <w:rPr>
+                <w:lang w:val="fr-FR" w:eastAsia="fr-FR" w:bidi="fr-FR"/>
+              </w:rPr>
+              <w:t>Respect des règles de qualité, de sécurité, de méthode et de traçabilité</w:t>
             </w:r>
           </w:p>
         </w:tc>
@@ -1115,7 +1317,10 @@
               <w:spacing w:after="0"/>
             </w:pPr>
             <w:r>
-              <w:t>Les exigences de qualite, securite, reglementation et tracabilite sont prises en compte.</w:t>
+              <w:rPr>
+                <w:lang w:val="fr-FR" w:eastAsia="fr-FR" w:bidi="fr-FR"/>
+              </w:rPr>
+              <w:t>Éléments observables explicitables dans le support écrit et confirmables lors de l'entretien.</w:t>
             </w:r>
           </w:p>
         </w:tc>
@@ -1129,7 +1334,11 @@
               <w:spacing w:after="0"/>
               <w:jc w:val="center"/>
             </w:pPr>
-            <w:r/>
+            <w:r>
+              <w:rPr>
+                <w:lang w:val="fr-FR" w:eastAsia="fr-FR" w:bidi="fr-FR"/>
+              </w:rPr>
+            </w:r>
           </w:p>
         </w:tc>
         <w:tc>
@@ -1142,7 +1351,11 @@
               <w:spacing w:after="0"/>
               <w:jc w:val="center"/>
             </w:pPr>
-            <w:r/>
+            <w:r>
+              <w:rPr>
+                <w:lang w:val="fr-FR" w:eastAsia="fr-FR" w:bidi="fr-FR"/>
+              </w:rPr>
+            </w:r>
           </w:p>
         </w:tc>
         <w:tc>
@@ -1155,7 +1368,11 @@
               <w:spacing w:after="0"/>
               <w:jc w:val="center"/>
             </w:pPr>
-            <w:r/>
+            <w:r>
+              <w:rPr>
+                <w:lang w:val="fr-FR" w:eastAsia="fr-FR" w:bidi="fr-FR"/>
+              </w:rPr>
+            </w:r>
           </w:p>
         </w:tc>
         <w:tc>
@@ -1168,7 +1385,11 @@
               <w:spacing w:after="0"/>
               <w:jc w:val="center"/>
             </w:pPr>
-            <w:r/>
+            <w:r>
+              <w:rPr>
+                <w:lang w:val="fr-FR" w:eastAsia="fr-FR" w:bidi="fr-FR"/>
+              </w:rPr>
+            </w:r>
           </w:p>
         </w:tc>
         <w:tc>
@@ -1180,7 +1401,11 @@
             <w:pPr>
               <w:spacing w:after="0"/>
             </w:pPr>
-            <w:r/>
+            <w:r>
+              <w:rPr>
+                <w:lang w:val="fr-FR" w:eastAsia="fr-FR" w:bidi="fr-FR"/>
+              </w:rPr>
+            </w:r>
           </w:p>
         </w:tc>
       </w:tr>
@@ -1195,7 +1420,10 @@
               <w:spacing w:after="0"/>
             </w:pPr>
             <w:r>
-              <w:t>Qualite de la presentation orale et capacite d'argumentation</w:t>
+              <w:rPr>
+                <w:lang w:val="fr-FR" w:eastAsia="fr-FR" w:bidi="fr-FR"/>
+              </w:rPr>
+              <w:t>Qualité de la présentation orale et capacité d'argumentation</w:t>
             </w:r>
           </w:p>
         </w:tc>
@@ -1209,7 +1437,10 @@
               <w:spacing w:after="0"/>
             </w:pPr>
             <w:r>
-              <w:t>Les exigences de qualite, securite, reglementation et tracabilite sont prises en compte.</w:t>
+              <w:rPr>
+                <w:lang w:val="fr-FR" w:eastAsia="fr-FR" w:bidi="fr-FR"/>
+              </w:rPr>
+              <w:t>Expression claire, structurée, argumentée et adaptée au questionnement du jury.</w:t>
             </w:r>
           </w:p>
         </w:tc>
@@ -1223,7 +1454,11 @@
               <w:spacing w:after="0"/>
               <w:jc w:val="center"/>
             </w:pPr>
-            <w:r/>
+            <w:r>
+              <w:rPr>
+                <w:lang w:val="fr-FR" w:eastAsia="fr-FR" w:bidi="fr-FR"/>
+              </w:rPr>
+            </w:r>
           </w:p>
         </w:tc>
         <w:tc>
@@ -1236,7 +1471,11 @@
               <w:spacing w:after="0"/>
               <w:jc w:val="center"/>
             </w:pPr>
-            <w:r/>
+            <w:r>
+              <w:rPr>
+                <w:lang w:val="fr-FR" w:eastAsia="fr-FR" w:bidi="fr-FR"/>
+              </w:rPr>
+            </w:r>
           </w:p>
         </w:tc>
         <w:tc>
@@ -1249,7 +1488,11 @@
               <w:spacing w:after="0"/>
               <w:jc w:val="center"/>
             </w:pPr>
-            <w:r/>
+            <w:r>
+              <w:rPr>
+                <w:lang w:val="fr-FR" w:eastAsia="fr-FR" w:bidi="fr-FR"/>
+              </w:rPr>
+            </w:r>
           </w:p>
         </w:tc>
         <w:tc>
@@ -1262,7 +1505,11 @@
               <w:spacing w:after="0"/>
               <w:jc w:val="center"/>
             </w:pPr>
-            <w:r/>
+            <w:r>
+              <w:rPr>
+                <w:lang w:val="fr-FR" w:eastAsia="fr-FR" w:bidi="fr-FR"/>
+              </w:rPr>
+            </w:r>
           </w:p>
         </w:tc>
         <w:tc>
@@ -1274,7 +1521,11 @@
             <w:pPr>
               <w:spacing w:after="0"/>
             </w:pPr>
-            <w:r/>
+            <w:r>
+              <w:rPr>
+                <w:lang w:val="fr-FR" w:eastAsia="fr-FR" w:bidi="fr-FR"/>
+              </w:rPr>
+            </w:r>
           </w:p>
         </w:tc>
       </w:tr>
@@ -1284,8 +1535,9 @@
       <w:r>
         <w:rPr>
           <w:b/>
+          <w:lang w:val="fr-FR" w:eastAsia="fr-FR" w:bidi="fr-FR"/>
         </w:rPr>
-        <w:t>Appreciation synthetique</w:t>
+        <w:t>Appréciation synthétique</w:t>
       </w:r>
     </w:p>
     <w:tbl>
@@ -1309,8 +1561,9 @@
             <w:r>
               <w:rPr>
                 <w:b/>
+                <w:lang w:val="fr-FR" w:eastAsia="fr-FR" w:bidi="fr-FR"/>
               </w:rPr>
-              <w:t>Points forts observes</w:t>
+              <w:t>Points forts observés</w:t>
             </w:r>
           </w:p>
         </w:tc>
@@ -1319,7 +1572,11 @@
             <w:tcW w:type="dxa" w:w="10658"/>
           </w:tcPr>
           <w:p>
-            <w:r/>
+            <w:r>
+              <w:rPr>
+                <w:lang w:val="fr-FR" w:eastAsia="fr-FR" w:bidi="fr-FR"/>
+              </w:rPr>
+            </w:r>
           </w:p>
         </w:tc>
       </w:tr>
@@ -1333,6 +1590,7 @@
             <w:r>
               <w:rPr>
                 <w:b/>
+                <w:lang w:val="fr-FR" w:eastAsia="fr-FR" w:bidi="fr-FR"/>
               </w:rPr>
               <w:t>Axes de progression / vigilance</w:t>
             </w:r>
@@ -1343,7 +1601,11 @@
             <w:tcW w:type="dxa" w:w="10658"/>
           </w:tcPr>
           <w:p>
-            <w:r/>
+            <w:r>
+              <w:rPr>
+                <w:lang w:val="fr-FR" w:eastAsia="fr-FR" w:bidi="fr-FR"/>
+              </w:rPr>
+            </w:r>
           </w:p>
         </w:tc>
       </w:tr>
@@ -1357,8 +1619,9 @@
             <w:r>
               <w:rPr>
                 <w:b/>
+                <w:lang w:val="fr-FR" w:eastAsia="fr-FR" w:bidi="fr-FR"/>
               </w:rPr>
-              <w:t>Decision / note / positionnement local</w:t>
+              <w:t>Décision / note / positionnement local</w:t>
             </w:r>
           </w:p>
         </w:tc>
@@ -1367,7 +1630,11 @@
             <w:tcW w:type="dxa" w:w="10658"/>
           </w:tcPr>
           <w:p>
-            <w:r/>
+            <w:r>
+              <w:rPr>
+                <w:lang w:val="fr-FR" w:eastAsia="fr-FR" w:bidi="fr-FR"/>
+              </w:rPr>
+            </w:r>
           </w:p>
         </w:tc>
       </w:tr>
@@ -1377,29 +1644,35 @@
       <w:r>
         <w:rPr>
           <w:b/>
+          <w:lang w:val="fr-FR" w:eastAsia="fr-FR" w:bidi="fr-FR"/>
         </w:rPr>
         <w:t>Fondement et sources de reconstitution</w:t>
       </w:r>
     </w:p>
     <w:p>
       <w:r>
-        <w:t>Aucune grille integrale publique n'a ete isolee ; la fiche repose sur les indices documentaires disponibles pour ce BTS.</w:t>
+        <w:rPr>
+          <w:lang w:val="fr-FR" w:eastAsia="fr-FR" w:bidi="fr-FR"/>
+        </w:rPr>
+        <w:t>Aucune grille intégrale publique n'a été isolée ; la fiche repose sur les indices documentaires disponibles pour ce BTS.</w:t>
       </w:r>
     </w:p>
     <w:p>
       <w:r>
         <w:rPr>
           <w:sz w:val="17"/>
+          <w:lang w:val="fr-FR" w:eastAsia="fr-FR" w:bidi="fr-FR"/>
         </w:rPr>
-        <w:t>Definition / modalites : https://www.education.gouv.fr/bo/20/Hebdo38/ESRS2019793A.htm</w:t>
+        <w:t>Référentiel : https://www.education.gouv.fr/sites/default/files/document/BO_ESR_29_611808.pdf-232641.pdf</w:t>
       </w:r>
     </w:p>
     <w:p>
       <w:r>
         <w:rPr>
           <w:sz w:val="17"/>
+          <w:lang w:val="fr-FR" w:eastAsia="fr-FR" w:bidi="fr-FR"/>
         </w:rPr>
-        <w:t>Source support : https://www.education.gouv.fr/sites/default/files/document/BO_38_MESRI_1336465.pdf-291534.pdf</w:t>
+        <w:t>Source support : https://www.education.gouv.fr/bo/20/Hebdo38/ESRS2019793A.htm</w:t>
       </w:r>
     </w:p>
     <w:sectPr>
@@ -1778,6 +2051,7 @@
     <w:rPr>
       <w:rFonts w:ascii="Aptos" w:hAnsi="Aptos"/>
       <w:sz w:val="20"/>
+      <w:lang w:val="fr-FR" w:eastAsia="fr-FR" w:bidi="fr-FR"/>
     </w:rPr>
   </w:style>
   <w:style w:type="paragraph" w:styleId="Header">

</xml_diff>

<commit_message>
Clean public BTS evaluation grid wording
</commit_message>
<xml_diff>
--- a/downloads/fiches/bts_aeronautique_fiche_evaluation.docx
+++ b/downloads/fiches/bts_aeronautique_fiche_evaluation.docx
@@ -9,11 +9,8 @@
       <w:r>
         <w:rPr>
           <w:b/>
-          <w:color w:val="1F4E79"/>
-          <w:sz w:val="32"/>
-          <w:lang w:val="fr-FR" w:eastAsia="fr-FR" w:bidi="fr-FR"/>
         </w:rPr>
-        <w:t>Fiche d'évaluation reconstituée - BTS Aéronautique</w:t>
+        <w:t>Fiche d'évaluation - BTS Aéronautique</w:t>
       </w:r>
     </w:p>
     <w:p>
@@ -27,31 +24,6 @@
           <w:lang w:val="fr-FR" w:eastAsia="fr-FR" w:bidi="fr-FR"/>
         </w:rPr>
         <w:t>Support évalué : Suivi de productions en milieu professionnel | Modalité : Mixte selon voie</w:t>
-      </w:r>
-    </w:p>
-    <w:p>
-      <w:pPr>
-        <w:jc w:val="center"/>
-      </w:pPr>
-      <w:r>
-        <w:rPr>
-          <w:b/>
-          <w:color w:val="C0504D"/>
-          <w:lang w:val="fr-FR" w:eastAsia="fr-FR" w:bidi="fr-FR"/>
-        </w:rPr>
-        <w:t>Trame minimale à compléter</w:t>
-      </w:r>
-    </w:p>
-    <w:p>
-      <w:pPr>
-        <w:spacing w:after="120"/>
-      </w:pPr>
-      <w:r>
-        <w:rPr>
-          <w:i/>
-          <w:lang w:val="fr-FR" w:eastAsia="fr-FR" w:bidi="fr-FR"/>
-        </w:rPr>
-        <w:t>Cette fiche est une reconstitution de travail à partir des sources publiques repérées au 2026-05-06. Elle ne remplace pas un formulaire national opposable lorsqu'une grille officielle complète existe par ailleurs.</w:t>
       </w:r>
     </w:p>
     <w:tbl>
@@ -108,9 +80,8 @@
             <w:r>
               <w:rPr>
                 <w:b/>
-                <w:lang w:val="fr-FR" w:eastAsia="fr-FR" w:bidi="fr-FR"/>
               </w:rPr>
-              <w:t>Modalité</w:t>
+              <w:t>Modalité d'évaluation</w:t>
             </w:r>
           </w:p>
         </w:tc>
@@ -169,10 +140,8 @@
           <w:p>
             <w:r>
               <w:rPr>
-                <w:b/>
-                <w:lang w:val="fr-FR" w:eastAsia="fr-FR" w:bidi="fr-FR"/>
+                <w:b w:val="0"/>
               </w:rPr>
-              <w:t>Statut documentaire</w:t>
             </w:r>
           </w:p>
         </w:tc>
@@ -184,9 +153,8 @@
           <w:p>
             <w:r>
               <w:rPr>
-                <w:lang w:val="fr-FR" w:eastAsia="fr-FR" w:bidi="fr-FR"/>
+                <w:b w:val="0"/>
               </w:rPr>
-              <w:t>CCF ou ponctuelle selon voie ; dossier support confirmé</w:t>
             </w:r>
           </w:p>
         </w:tc>
@@ -293,10 +261,8 @@
           <w:p>
             <w:r>
               <w:rPr>
-                <w:b/>
-                <w:lang w:val="fr-FR" w:eastAsia="fr-FR" w:bidi="fr-FR"/>
+                <w:b w:val="0"/>
               </w:rPr>
-              <w:t>Niveau de reconstitution</w:t>
             </w:r>
           </w:p>
         </w:tc>
@@ -308,71 +274,8 @@
           <w:p>
             <w:r>
               <w:rPr>
-                <w:lang w:val="fr-FR" w:eastAsia="fr-FR" w:bidi="fr-FR"/>
+                <w:b w:val="0"/>
               </w:rPr>
-              <w:t>Trame minimale à compléter</w:t>
-            </w:r>
-          </w:p>
-        </w:tc>
-      </w:tr>
-      <w:tr>
-        <w:tc>
-          <w:tcPr>
-            <w:tcW w:type="dxa" w:w="1814"/>
-            <w:vAlign w:val="center"/>
-            <w:shd w:fill="D9EAF7"/>
-          </w:tcPr>
-          <w:p>
-            <w:r>
-              <w:rPr>
-                <w:b/>
-                <w:lang w:val="fr-FR" w:eastAsia="fr-FR" w:bidi="fr-FR"/>
-              </w:rPr>
-              <w:t>Sources modèle</w:t>
-            </w:r>
-          </w:p>
-        </w:tc>
-        <w:tc>
-          <w:tcPr>
-            <w:tcW w:type="dxa" w:w="4535"/>
-            <w:vAlign w:val="center"/>
-          </w:tcPr>
-          <w:p>
-            <w:r>
-              <w:rPr>
-                <w:lang w:val="fr-FR" w:eastAsia="fr-FR" w:bidi="fr-FR"/>
-              </w:rPr>
-              <w:t>Le référentiel du BTS Aéronautique mentionne l'utilisation d'une grille d'évaluation pour le contrôle en cours de formation (CCF) de certaines épreuves, notamment la physique-chimie, mais la grille spécifique pour l'épreuve E61 n'est pas directement accessible. Un rapport de stage est requis pour l'épreuve E61.</w:t>
-            </w:r>
-          </w:p>
-        </w:tc>
-        <w:tc>
-          <w:tcPr>
-            <w:tcW w:type="dxa" w:w="1814"/>
-            <w:vAlign w:val="center"/>
-            <w:shd w:fill="D9EAF7"/>
-          </w:tcPr>
-          <w:p>
-            <w:r>
-              <w:rPr>
-                <w:b/>
-                <w:lang w:val="fr-FR" w:eastAsia="fr-FR" w:bidi="fr-FR"/>
-              </w:rPr>
-              <w:t>Document jury</w:t>
-            </w:r>
-          </w:p>
-        </w:tc>
-        <w:tc>
-          <w:tcPr>
-            <w:tcW w:type="dxa" w:w="6009"/>
-            <w:vAlign w:val="center"/>
-          </w:tcPr>
-          <w:p>
-            <w:r>
-              <w:rPr>
-                <w:lang w:val="fr-FR" w:eastAsia="fr-FR" w:bidi="fr-FR"/>
-              </w:rPr>
-              <w:t>Non retrouvé</w:t>
             </w:r>
           </w:p>
         </w:tc>
@@ -1619,9 +1522,8 @@
             <w:r>
               <w:rPr>
                 <w:b/>
-                <w:lang w:val="fr-FR" w:eastAsia="fr-FR" w:bidi="fr-FR"/>
               </w:rPr>
-              <w:t>Décision / note / positionnement local</w:t>
+              <w:t>Note proposée</w:t>
             </w:r>
           </w:p>
         </w:tc>
@@ -1643,27 +1545,9 @@
     <w:p>
       <w:r>
         <w:rPr>
-          <w:b/>
-          <w:lang w:val="fr-FR" w:eastAsia="fr-FR" w:bidi="fr-FR"/>
-        </w:rPr>
-        <w:t>Fondement et sources de reconstitution</w:t>
-      </w:r>
-    </w:p>
-    <w:p>
-      <w:r>
-        <w:rPr>
           <w:lang w:val="fr-FR" w:eastAsia="fr-FR" w:bidi="fr-FR"/>
         </w:rPr>
         <w:t>Aucune grille intégrale publique n'a été isolée ; la fiche repose sur les indices documentaires disponibles pour ce BTS.</w:t>
-      </w:r>
-    </w:p>
-    <w:p>
-      <w:r>
-        <w:rPr>
-          <w:sz w:val="17"/>
-          <w:lang w:val="fr-FR" w:eastAsia="fr-FR" w:bidi="fr-FR"/>
-        </w:rPr>
-        <w:t>Référentiel : https://www.education.gouv.fr/sites/default/files/document/BO_ESR_29_611808.pdf-232641.pdf</w:t>
       </w:r>
     </w:p>
     <w:p>

</xml_diff>